<commit_message>
Update analysis report with SQL findings
</commit_message>
<xml_diff>
--- a/Docs/Diabetes_Risk_Analysis_Report.docx
+++ b/Docs/Diabetes_Risk_Analysis_Report.docx
@@ -954,16 +954,14 @@
         </w:rPr>
         <w:t xml:space="preserve">Household income showed a similar socioeconomic pattern. Among the 646 participants with valid income information, diabetes percentages decreased across the four broad income categories: 34.8% for households earning less than $25,000, 29.4% for $25,000–$49,999, 23.5% for $50,000–$99,999, and 20.3% for households earning $100,000 or more. However, income had substantial missing data: 354 of the 1,000 observations (35.4%) did not contain valid income information. Therefore, the income results should be interpreted with </w:t>
       </w:r>
-      <w:proofErr w:type="gramStart"/>
       <w:r>
         <w:rPr>
           <w:rFonts w:ascii="Times New Roman" w:eastAsia="Times New Roman" w:hAnsi="Times New Roman" w:cs="Times New Roman"/>
           <w:kern w:val="0"/>
           <w14:ligatures w14:val="none"/>
         </w:rPr>
-        <w:t>particular caution</w:t>
-      </w:r>
-      <w:proofErr w:type="gramEnd"/>
+        <w:t>caution</w:t>
+      </w:r>
       <w:r>
         <w:rPr>
           <w:rFonts w:ascii="Times New Roman" w:eastAsia="Times New Roman" w:hAnsi="Times New Roman" w:cs="Times New Roman"/>
@@ -976,19 +974,98 @@
     <w:p>
       <w:pPr>
         <w:spacing w:before="100" w:beforeAutospacing="1" w:after="100" w:afterAutospacing="1" w:line="240" w:lineRule="auto"/>
+      </w:pPr>
+      <w:r>
         <w:rPr>
           <w:rFonts w:ascii="Times New Roman" w:eastAsia="Times New Roman" w:hAnsi="Times New Roman" w:cs="Times New Roman"/>
           <w:kern w:val="0"/>
           <w14:ligatures w14:val="none"/>
         </w:rPr>
-      </w:pPr>
-      <w:r>
+        <w:t xml:space="preserve">Overall, the exploratory analysis identified BMI category, physical activity, age, education, and income as factors showing meaningful differences in diabetes percentage within the development sample. The strongest observed percentages occurred among participants classified as obese, participants with less than a high school education, lower-income participants, and participants reporting no physical activity. </w:t>
+      </w:r>
+      <w:r>
+        <w:t xml:space="preserve">These findings were subsequently validated through SQL analysis in Google </w:t>
+      </w:r>
+      <w:proofErr w:type="spellStart"/>
+      <w:r>
+        <w:t>BigQuery</w:t>
+      </w:r>
+      <w:proofErr w:type="spellEnd"/>
+      <w:r>
+        <w:t xml:space="preserve"> and should not be interpreted as evidence of causation.</w:t>
+      </w:r>
+    </w:p>
+    <w:p>
+      <w:pPr>
+        <w:spacing w:before="100" w:beforeAutospacing="1" w:after="100" w:afterAutospacing="1" w:line="240" w:lineRule="auto"/>
+        <w:rPr>
+          <w:rFonts w:ascii="Times New Roman" w:hAnsi="Times New Roman" w:cs="Times New Roman"/>
+          <w:b/>
+          <w:bCs/>
+          <w:sz w:val="28"/>
+          <w:szCs w:val="28"/>
+        </w:rPr>
+      </w:pPr>
+      <w:r>
+        <w:rPr>
+          <w:rFonts w:ascii="Times New Roman" w:hAnsi="Times New Roman" w:cs="Times New Roman"/>
+          <w:b/>
+          <w:bCs/>
+          <w:sz w:val="28"/>
+          <w:szCs w:val="28"/>
+        </w:rPr>
+        <w:t>SQL Analysis</w:t>
+      </w:r>
+    </w:p>
+    <w:p>
+      <w:pPr>
+        <w:spacing w:before="100" w:beforeAutospacing="1" w:after="100" w:afterAutospacing="1" w:line="240" w:lineRule="auto"/>
+      </w:pPr>
+      <w:r>
+        <w:t xml:space="preserve">SQL analysis was conducted in Google </w:t>
+      </w:r>
+      <w:proofErr w:type="spellStart"/>
+      <w:r>
+        <w:t>BigQuery</w:t>
+      </w:r>
+      <w:proofErr w:type="spellEnd"/>
+      <w:r>
+        <w:t xml:space="preserve"> to validate the cleaned dataset and reproduce the main results from the R-based exploratory analysis. Data validation confirmed that the imported table contained 1,000 records and that missing-value counts were consistent with the cleaned R dataset. Eight SQL queries were used to examine diabetes status and diabetes percentages across sex, age group, BMI category, physical activity, education, and household income. The SQL results matched the corresponding R results, providing cross-tool validation of the analysis workflow.</w:t>
+      </w:r>
+    </w:p>
+    <w:p>
+      <w:pPr>
+        <w:spacing w:before="100" w:beforeAutospacing="1" w:after="100" w:afterAutospacing="1" w:line="240" w:lineRule="auto"/>
         <w:rPr>
           <w:rFonts w:ascii="Times New Roman" w:eastAsia="Times New Roman" w:hAnsi="Times New Roman" w:cs="Times New Roman"/>
+          <w:b/>
+          <w:bCs/>
           <w:kern w:val="0"/>
+          <w:sz w:val="28"/>
+          <w:szCs w:val="28"/>
           <w14:ligatures w14:val="none"/>
         </w:rPr>
-        <w:t>Overall, the exploratory analysis identified BMI category, physical activity, age, education, and income as factors showing meaningful differences in diabetes percentage within the development sample. The strongest observed percentages occurred among participants classified as obese, participants with less than a high school education, lower-income participants, and participants reporting no physical activity. These findings identify useful areas for further SQL and statistical analysis but should not be interpreted as evidence of causation.</w:t>
+      </w:pPr>
+      <w:r>
+        <w:t xml:space="preserve">Across the grouped analyses, SQL reproduced the same results obtained in R. For example, diabetes was reported by 27.5% of the </w:t>
+      </w:r>
+      <w:r>
+        <w:t>sample</w:t>
+      </w:r>
+      <w:r>
+        <w:t xml:space="preserve">, participants classified as obese had a diabetes percentage of 36.1%, and participants reporting no physical activity had a diabetes percentage of 31.7%. SQL also confirmed </w:t>
+      </w:r>
+      <w:r>
+        <w:lastRenderedPageBreak/>
+        <w:t xml:space="preserve">that 354 records, or 35.4% of the sample, were missing valid household income information. These consistent results support the reliability of the data-processing and analysis workflow across R and </w:t>
+      </w:r>
+      <w:proofErr w:type="spellStart"/>
+      <w:r>
+        <w:t>BigQuery</w:t>
+      </w:r>
+      <w:proofErr w:type="spellEnd"/>
+      <w:r>
+        <w:t>.</w:t>
       </w:r>
     </w:p>
     <w:p>
@@ -1033,23 +1110,7 @@
           <w:kern w:val="0"/>
           <w14:ligatures w14:val="none"/>
         </w:rPr>
-        <w:t xml:space="preserve">All findings in this section are based on a BRFSS 2024 development sample of 1,000 records created because of computational resource limitations. The current analysis does not apply BRFSS survey weights and therefore cannot be used to estimate U.S. national diabetes prevalence. The BRFSS is also based largely on self-reported survey information, and some variables contain missing responses. Income is especially limited by its 35.4% missing-data rate. In addition, </w:t>
-      </w:r>
-      <w:r>
-        <w:rPr>
-          <w:rFonts w:ascii="Times New Roman" w:eastAsia="Times New Roman" w:hAnsi="Times New Roman" w:cs="Times New Roman"/>
-          <w:kern w:val="0"/>
-          <w14:ligatures w14:val="none"/>
-        </w:rPr>
-        <w:t>cross</w:t>
-      </w:r>
-      <w:r>
-        <w:rPr>
-          <w:rFonts w:ascii="Times New Roman" w:eastAsia="Times New Roman" w:hAnsi="Times New Roman" w:cs="Times New Roman"/>
-          <w:kern w:val="0"/>
-          <w14:ligatures w14:val="none"/>
-        </w:rPr>
-        <w:t>-sectional study design can identify associations and descriptive patterns but cannot establish causal relationships. A nationally representative analysis would require the complete BRFSS dataset together with the appropriate survey weighting methodology.</w:t>
+        <w:t>All findings in this section are based on a BRFSS 2024 development sample of 1,000 records created because of computational resource limitations. The current analysis does not apply BRFSS survey weights and therefore cannot be used to estimate U.S. national diabetes prevalence. The BRFSS is also based largely on self-reported survey information, and some variables contain missing responses. Income is especially limited by its 35.4% missing-data rate. In addition, cross-sectional study design can identify associations and descriptive patterns but cannot establish causal relationships. A nationally representative analysis would require the complete BRFSS dataset together with the appropriate survey weighting methodology.</w:t>
       </w:r>
     </w:p>
     <w:p>

</xml_diff>